<commit_message>
Use American spelling per APA style
Co-Authored-By: Claude Opus 5.5 <noreply@anthropic.com>
Claude-Session: https://claude.ai/code/session_01XUgWraH8UoCsH86oPUN8Lo
</commit_message>
<xml_diff>
--- a/research_paper/Research_Paper_Diabetes_Prediction.docx
+++ b/research_paper/Research_Paper_Diabetes_Prediction.docx
@@ -223,7 +223,7 @@
           <w:sz w:val="24"/>
           <w:szCs w:val="24"/>
         </w:rPr>
-        <w:t xml:space="preserve"> = 768; 34.9% positive), I built leakage-safe scikit-learn pipelines crossing four missing-data strategies (zeros retained, median, k-nearest-neighbour, and iterative imputation) with three classifiers (logistic regression, random forest, and XGBoost). All twelve configurations were evaluated with five-times-repeated 10-fold cross-validation, run in parallel with Dask, and then tested on a stratified hold-out set. Mean cross-validated ROC-AUC ranged only from .823 to .838. Treating zeros as missing improved AUC for every model, but by less than .01, far below the fold-to-fold standard deviation (about .05). On the hold-out set, logistic regression matched the ensembles (AUC = .823, recall = .701) while remaining interpretable, with glucose and body-mass index dominating its predictions. A subgroup audit, however, showed that sensitivity fell from .822 in patients aged 30 or older to .455 in those under 30, a gap that aggregate metrics conceal. For small tabular clinical datasets, analysts should prioritise sound pipeline design, calibration, and subgroup evaluation over algorithmic complexity, and the open-source Python stack makes such rigour inexpensive.</w:t>
+        <w:t xml:space="preserve"> = 768; 34.9% positive), I built leakage-safe scikit-learn pipelines crossing four missing-data strategies (zeros retained, median, k-nearest-neighbor, and iterative imputation) with three classifiers (logistic regression, random forest, and XGBoost). All twelve configurations were evaluated with five-times-repeated 10-fold cross-validation, run in parallel with Dask, and then tested on a stratified hold-out set. Mean cross-validated ROC-AUC ranged only from .823 to .838. Treating zeros as missing improved AUC for every model, but by less than .01, far below the fold-to-fold standard deviation (about .05). On the hold-out set, logistic regression matched the ensembles (AUC = .823, recall = .701) while remaining interpretable, with glucose and body-mass index dominating its predictions. A subgroup audit, however, showed that sensitivity fell from .822 in patients aged 30 or older to .455 in those under 30, a gap that aggregate metrics conceal. For small tabular clinical datasets, analysts should prioritize sound pipeline design, calibration, and subgroup evaluation over algorithmic complexity, and the open-source Python stack makes such rigor inexpensive.</w:t>
       </w:r>
     </w:p>
     <w:p>
@@ -465,7 +465,7 @@
           <w:sz w:val="24"/>
           <w:szCs w:val="24"/>
         </w:rPr>
-        <w:t xml:space="preserve">Major reviews of clinical ML (Rajkomar et al., 2019; Rajpurkar et al., 2022; Topol, 2019) note that impressive retrospective accuracy has rarely translated into clinical benefit, partly because development studies are poorly reported and insufficiently validated. The TRIPOD statement (Collins et al., 2015) standardises how prediction models should be reported, including the handling of missing data, and Van Calster et al. (2019) call calibration the "Achilles heel" of predictive analytics because it is so often ignored.</w:t>
+        <w:t xml:space="preserve">Major reviews of clinical ML (Rajkomar et al., 2019; Rajpurkar et al., 2022; Topol, 2019) note that impressive retrospective accuracy has rarely translated into clinical benefit, partly because development studies are poorly reported and insufficiently validated. The TRIPOD statement (Collins et al., 2015) standardizes how prediction models should be reported, including the handling of missing data, and Van Calster et al. (2019) call calibration the "Achilles heel" of predictive analytics because it is so often ignored.</w:t>
       </w:r>
     </w:p>
     <w:p>
@@ -553,7 +553,7 @@
           <w:sz w:val="24"/>
           <w:szCs w:val="24"/>
         </w:rPr>
-        <w:t xml:space="preserve">Clinical records are rarely complete, and Sterne et al. (2009) warn that both complete-case analysis and naive single imputation can bias results. Multivariate imputation by chained equations (MICE; van Buuren &amp; Groothuis-Oudshoorn, 2011) and k-nearest-neighbour (KNN) imputation (Troyanskaya et al., 2001) are established alternatives, and scikit-learn implements median, KNN, and MICE-style imputers within a Pipeline interface that fits each step only on training folds (Pedregosa et al., 2011). This matters because fitting imputers or scalers on the full dataset before splitting is a textbook form of leakage (Kaufman et al., 2012), a leading cause of irreproducible ML-based science (Kapoor &amp; Narayanan, 2023).</w:t>
+        <w:t xml:space="preserve">Clinical records are rarely complete, and Sterne et al. (2009) warn that both complete-case analysis and naive single imputation can bias results. Multivariate imputation by chained equations (MICE; van Buuren &amp; Groothuis-Oudshoorn, 2011) and k-nearest-neighbor (KNN) imputation (Troyanskaya et al., 2001) are established alternatives, and scikit-learn implements median, KNN, and MICE-style imputers within a Pipeline interface that fits each step only on training folds (Pedregosa et al., 2011). This matters because fitting imputers or scalers on the full dataset before splitting is a textbook form of leakage (Kaufman et al., 2012), a leading cause of irreproducible ML-based science (Kapoor &amp; Narayanan, 2023).</w:t>
       </w:r>
     </w:p>
     <w:p>
@@ -588,7 +588,7 @@
           <w:sz w:val="24"/>
           <w:szCs w:val="24"/>
         </w:rPr>
-        <w:t xml:space="preserve">Obermeyer et al. (2019) showed that a widely used commercial algorithm underestimated the health needs of Black patients because it used cost as a proxy for need. Rajkomar et al. (2018) argue that fairness must be designed into clinical ML from the start, and Mehrabi et al. (2021) catalogue bias metrics such as group-wise true- and false-positive rates, in the spirit of equal opportunity (Hardt et al., 2016). For explanation, permutation importance (Fisher et al., 2019) and Shapley values (Lundberg &amp; Lee, 2017) are widely used, though Rudin (2019) cautions that they only approximate the model.</w:t>
+        <w:t xml:space="preserve">Obermeyer et al. (2019) showed that a widely used commercial algorithm underestimated the health needs of Black patients because it used cost as a proxy for need. Rajkomar et al. (2018) argue that fairness must be designed into clinical ML from the start, and Mehrabi et al. (2021) catalog bias metrics such as group-wise true- and false-positive rates, in the spirit of equal opportunity (Hardt et al., 2016). For explanation, permutation importance (Fisher et al., 2019) and Shapley values (Lundberg &amp; Lee, 2017) are widely used, though Rudin (2019) cautions that they only approximate the model.</w:t>
       </w:r>
     </w:p>
     <w:p>
@@ -675,7 +675,7 @@
           <w:sz w:val="24"/>
           <w:szCs w:val="24"/>
         </w:rPr>
-        <w:t xml:space="preserve">The study uses a quantitative, comparative experimental design on the public Pima Indians Diabetes dataset (Smith et al., 1988): 768 women aged 21 or older of Pima heritage, eight predictors (pregnancies, two-hour plasma glucose, diastolic blood pressure, triceps skinfold, two-hour serum insulin, body-mass index [BMI], a diabetes pedigree function summarising family history, and age), and a binary outcome indicating diabetes within five years. The data are de-identified and public. As Table 1 shows, several variables contain physiologically impossible zeros; nearly half of insulin values and almost 30% of skinfold values are zero, which in practice means "not measured."</w:t>
+        <w:t xml:space="preserve">The study uses a quantitative, comparative experimental design on the public Pima Indians Diabetes dataset (Smith et al., 1988): 768 women aged 21 or older of Pima heritage, eight predictors (pregnancies, two-hour plasma glucose, diastolic blood pressure, triceps skinfold, two-hour serum insulin, body-mass index [BMI], a diabetes pedigree function summarizing family history, and age), and a binary outcome indicating diabetes within five years. The data are de-identified and public. As Table 1 shows, several variables contain physiologically impossible zeros; nearly half of insulin values and almost 30% of skinfold values are zero, which in practice means "not measured."</w:t>
       </w:r>
     </w:p>
     <w:p>
@@ -2878,7 +2878,7 @@
           <w:sz w:val="24"/>
           <w:szCs w:val="24"/>
         </w:rPr>
-        <w:t xml:space="preserve"> (zeros retained, standardisation only); (b) </w:t>
+        <w:t xml:space="preserve"> (zeros retained, standardization only); (b) </w:t>
       </w:r>
       <w:r>
         <w:rPr>
@@ -2926,7 +2926,7 @@
           <w:sz w:val="24"/>
           <w:szCs w:val="24"/>
         </w:rPr>
-        <w:t xml:space="preserve"> with five neighbours (Troyanskaya et al., 2001); and (d) </w:t>
+        <w:t xml:space="preserve"> with five neighbors (Troyanskaya et al., 2001); and (d) </w:t>
       </w:r>
       <w:r>
         <w:rPr>
@@ -2974,7 +2974,7 @@
           <w:sz w:val="24"/>
           <w:szCs w:val="24"/>
         </w:rPr>
-        <w:t xml:space="preserve"> (van Buuren &amp; Groothuis-Oudshoorn, 2011). Each was paired with L2-regularised logistic regression, a 300-tree random forest (Breiman, 2001), and a shallow XGBoost model (300 trees, depth 3, learning rate 0.05). Class imbalance was handled with balanced class weights. Hyperparameters were fixed in advance, so differences reflect methods rather than tuning effort.</w:t>
+        <w:t xml:space="preserve"> (van Buuren &amp; Groothuis-Oudshoorn, 2011). Each was paired with L2-regularized logistic regression, a 300-tree random forest (Breiman, 2001), and a shallow XGBoost model (300 trees, depth 3, learning rate 0.05). Class imbalance was handled with balanced class weights. Hyperparameters were fixed in advance, so differences reflect methods rather than tuning effort.</w:t>
       </w:r>
     </w:p>
     <w:p>
@@ -3009,7 +3009,7 @@
           <w:sz w:val="24"/>
           <w:szCs w:val="24"/>
         </w:rPr>
-        <w:t xml:space="preserve">Each configuration was evaluated with stratified 10-fold cross-validation repeated five times (600 fits in total). The twelve independent experiments ran in parallel as Dask delayed tasks in under four minutes. Metrics were ROC-AUC, accuracy, precision, recall (sensitivity), F1, and the Brier score, which reflects calibration (Van Calster et al., 2019). Paired fold-level AUCs were compared with Wilcoxon signed-rank tests, interpreted cautiously because overlapping training sets make such tests optimistic (Nadeau &amp; Bengio, 2003). A stratified 75/25 split then provided a hold-out test set (</w:t>
+        <w:t xml:space="preserve">Each configuration was evaluated with stratified 10-fold cross-validation repeated five times (600 fits in total). The twelve independent experiments ran in parallel as Dask delayed tasks in under four minutes. Metrics were ROC-AUC, accuracy, precision, recall (sensitivity), F1, and the Brier score, which reflects calibration (Van Calster et al., 2019). Paired fold-level AUCs were compared with Wilcoxon signed-rank tests, interpreted cautiously because overlapping training sets make such tests optimiztic (Nadeau &amp; Bengio, 2003). A stratified 75/25 split then provided a hold-out test set (</w:t>
       </w:r>
       <w:r>
         <w:rPr>
@@ -3068,7 +3068,7 @@
           <w:sz w:val="24"/>
           <w:szCs w:val="24"/>
         </w:rPr>
-        <w:t xml:space="preserve">The dataset is small, decades old, and drawn from one population of women, so findings may not generalise to other groups or to contemporary records, and subgroup estimates are imprecise. Hyperparameters were not tuned, and the retrospective design offers no evidence of clinical utility.</w:t>
+        <w:t xml:space="preserve">The dataset is small, decades old, and drawn from one population of women, so findings may not generalize to other groups or to contemporary records, and subgroup estimates are imprecise. Hyperparameters were not tuned, and the retrospective design offers no evidence of clinical utility.</w:t>
       </w:r>
     </w:p>
     <w:p>
@@ -3120,7 +3120,7 @@
           <w:sz w:val="24"/>
           <w:szCs w:val="24"/>
         </w:rPr>
-        <w:t xml:space="preserve">Table 2 summarises the cross-validated results. The most striking finding is how </w:t>
+        <w:t xml:space="preserve">Table 2 summarizes the cross-validated results. The most striking finding is how </w:t>
       </w:r>
       <w:r>
         <w:rPr>
@@ -6230,7 +6230,7 @@
           <w:sz w:val="24"/>
           <w:szCs w:val="24"/>
         </w:rPr>
-        <w:t xml:space="preserve">Recognising</w:t>
+        <w:t xml:space="preserve">Recognizing</w:t>
       </w:r>
       <w:r>
         <w:rPr>
@@ -8724,7 +8724,7 @@
           <w:sz w:val="24"/>
           <w:szCs w:val="24"/>
         </w:rPr>
-        <w:t xml:space="preserve">Practically, the Python stack makes rigorous prototyping cheap: all 600 model fits and figures came from one short open-source script, which matters for low-resource health systems. The scikit-learn Pipeline is a safeguard, not just a convenience, against the leakage Kapoor and Narayanan (2023) find is common. And because simple models perform as well as complex ones, organisations can favour transparent models clinicians can verify (Collins et al., 2015).</w:t>
+        <w:t xml:space="preserve">Practically, the Python stack makes rigorous prototyping cheap: all 600 model fits and figures came from one short open-source script, which matters for low-resource health systems. The scikit-learn Pipeline is a safeguard, not just a convenience, against the leakage Kapoor and Narayanan (2023) find is common. And because simple models perform as well as complex ones, organizations can favor transparent models clinicians can verify (Collins et al., 2015).</w:t>
       </w:r>
     </w:p>
     <w:p>
@@ -8777,7 +8777,7 @@
           <w:sz w:val="24"/>
           <w:szCs w:val="24"/>
         </w:rPr>
-        <w:t xml:space="preserve">Across twelve leakage-safe Python pipelines, recognising impossible zeros as missing yielded small but consistent gains, while the choice of imputer and classifier mattered little. Interpretable logistic regression matched the ensembles and is the most defensible choice, but its sensitivity for patients under 30 was roughly half that for older patients, a weakness hidden by aggregate metrics.</w:t>
+        <w:t xml:space="preserve">Across twelve leakage-safe Python pipelines, recognizing impossible zeros as missing yielded small but consistent gains, while the choice of imputer and classifier mattered little. Interpretable logistic regression matched the ensembles and is the most defensible choice, but its sensitivity for patients under 30 was roughly half that for older patients, a weakness hidden by aggregate metrics.</w:t>
       </w:r>
     </w:p>
     <w:p>
@@ -8795,7 +8795,7 @@
           <w:sz w:val="24"/>
           <w:szCs w:val="24"/>
         </w:rPr>
-        <w:t xml:space="preserve">The study contributes a replicable, fully open-source framework that treats rigour, calibration, and fairness as seriously as accuracy. Future work should validate it on larger, more diverse health records, test multiple imputation and group-aware recalibration, and test TensorFlow or Keras deep models. It could support primary-care and pharmacy screening once locally validated.</w:t>
+        <w:t xml:space="preserve">The study contributes a replicable, fully open-source framework that treats rigor, calibration, and fairness as seriously as accuracy. Future work should validate it on larger, more diverse health records, test multiple imputation and group-aware recalibration, and test TensorFlow or Keras deep models. It could support primary-care and pharmacy screening once locally validated.</w:t>
       </w:r>
     </w:p>
     <w:p>

</xml_diff>